<commit_message>
Resume Updated and moved the old one to Archive
</commit_message>
<xml_diff>
--- a/HarshaVardhan_QA_Engineer_Resume.docx
+++ b/HarshaVardhan_QA_Engineer_Resume.docx
@@ -242,18 +242,16 @@
             <w:rStyle w:val="Hyperlink"/>
             <w:rFonts w:ascii="Times New Roman" w:eastAsia="Cambria" w:hAnsi="Times New Roman" w:cs="Times New Roman"/>
           </w:rPr>
-          <w:t>linkedin.com/in/</w:t>
+          <w:t>portfolio.harshavardhanofficial.com</w:t>
         </w:r>
-        <w:proofErr w:type="spellStart"/>
-        <w:r>
-          <w:rPr>
-            <w:rStyle w:val="Hyperlink"/>
-            <w:rFonts w:ascii="Times New Roman" w:eastAsia="Cambria" w:hAnsi="Times New Roman" w:cs="Times New Roman"/>
-          </w:rPr>
-          <w:t>harsha-vardhan-vallabhaneni</w:t>
-        </w:r>
-        <w:proofErr w:type="spellEnd"/>
       </w:hyperlink>
+      <w:r>
+        <w:rPr>
+          <w:rFonts w:ascii="Times New Roman" w:eastAsia="Cambria" w:hAnsi="Times New Roman" w:cs="Times New Roman"/>
+          <w:color w:val="215868"/>
+        </w:rPr>
+        <w:t xml:space="preserve"> </w:t>
+      </w:r>
     </w:p>
     <w:p>
       <w:pPr>
@@ -395,7 +393,43 @@
           <w:sz w:val="24"/>
           <w:szCs w:val="24"/>
         </w:rPr>
-        <w:t xml:space="preserve">Software QA Engineer with 2.5+ years of experience in the insurance domain at Cognizant. Experienced in manual testing, API testing, and test automation using Selenium WebDriver, Java, TestNG, SOAP UI, and SQL. </w:t>
+        <w:t xml:space="preserve">Software QA Engineer with </w:t>
+      </w:r>
+      <w:r>
+        <w:rPr>
+          <w:rFonts w:ascii="Times New Roman" w:hAnsi="Times New Roman" w:cs="Times New Roman"/>
+          <w:color w:val="auto"/>
+          <w:sz w:val="24"/>
+          <w:szCs w:val="24"/>
+        </w:rPr>
+        <w:t>3</w:t>
+      </w:r>
+      <w:r>
+        <w:rPr>
+          <w:rFonts w:ascii="Times New Roman" w:hAnsi="Times New Roman" w:cs="Times New Roman"/>
+          <w:color w:val="auto"/>
+          <w:sz w:val="24"/>
+          <w:szCs w:val="24"/>
+        </w:rPr>
+        <w:t xml:space="preserve">+ years of experience </w:t>
+      </w:r>
+      <w:r>
+        <w:rPr>
+          <w:rFonts w:ascii="Times New Roman" w:hAnsi="Times New Roman" w:cs="Times New Roman"/>
+          <w:color w:val="auto"/>
+          <w:sz w:val="24"/>
+          <w:szCs w:val="24"/>
+        </w:rPr>
+        <w:t xml:space="preserve">at the Cognizant </w:t>
+      </w:r>
+      <w:r>
+        <w:rPr>
+          <w:rFonts w:ascii="Times New Roman" w:hAnsi="Times New Roman" w:cs="Times New Roman"/>
+          <w:color w:val="auto"/>
+          <w:sz w:val="24"/>
+          <w:szCs w:val="24"/>
+        </w:rPr>
+        <w:t xml:space="preserve">in insurance domain. Experienced in manual testing, API testing, and test automation using Selenium WebDriver, Java, TestNG, SOAP UI, and SQL. </w:t>
       </w:r>
       <w:r>
         <w:rPr>
@@ -547,13 +581,8 @@
       <w:r>
         <w:t xml:space="preserve">: HP ALM, </w:t>
       </w:r>
-      <w:proofErr w:type="spellStart"/>
-      <w:r>
-        <w:t>LeanKit</w:t>
-      </w:r>
-      <w:proofErr w:type="spellEnd"/>
-      <w:r>
-        <w:t xml:space="preserve">, </w:t>
+      <w:r>
+        <w:t xml:space="preserve">LeanKit, </w:t>
       </w:r>
       <w:r>
         <w:t>SOAP UI,</w:t>
@@ -1173,23 +1202,7 @@
           <w:b/>
           <w:bCs/>
         </w:rPr>
-        <w:t xml:space="preserve">WCA Policy </w:t>
-      </w:r>
-      <w:proofErr w:type="spellStart"/>
-      <w:r>
-        <w:rPr>
-          <w:b/>
-          <w:bCs/>
-        </w:rPr>
-        <w:t>Center</w:t>
-      </w:r>
-      <w:proofErr w:type="spellEnd"/>
-      <w:r>
-        <w:rPr>
-          <w:b/>
-          <w:bCs/>
-        </w:rPr>
-        <w:t xml:space="preserve"> Testing — Workers Compensation LOB</w:t>
+        <w:t>WCA Policy Center Testing — Workers Compensation LOB</w:t>
       </w:r>
     </w:p>
     <w:p>
@@ -1324,8 +1337,6 @@
         </w:rPr>
         <w:t xml:space="preserve"> (</w:t>
       </w:r>
-      <w:proofErr w:type="spellStart"/>
-      <w:proofErr w:type="gramStart"/>
       <w:r>
         <w:rPr>
           <w:rFonts w:ascii="Times New Roman" w:eastAsia="Cambria" w:hAnsi="Times New Roman" w:cs="Times New Roman"/>
@@ -1356,8 +1367,6 @@
         </w:rPr>
         <w:t>Tech</w:t>
       </w:r>
-      <w:proofErr w:type="spellEnd"/>
-      <w:proofErr w:type="gramEnd"/>
       <w:r>
         <w:rPr>
           <w:rFonts w:ascii="Times New Roman" w:eastAsia="Cambria" w:hAnsi="Times New Roman" w:cs="Times New Roman"/>
@@ -3006,6 +3015,18 @@
       <w:szCs w:val="24"/>
     </w:rPr>
   </w:style>
+  <w:style w:type="character" w:styleId="FollowedHyperlink">
+    <w:name w:val="FollowedHyperlink"/>
+    <w:basedOn w:val="DefaultParagraphFont"/>
+    <w:uiPriority w:val="99"/>
+    <w:semiHidden/>
+    <w:unhideWhenUsed/>
+    <w:rsid w:val="00077DB3"/>
+    <w:rPr>
+      <w:color w:val="954F72" w:themeColor="followedHyperlink"/>
+      <w:u w:val="single"/>
+    </w:rPr>
+  </w:style>
 </w:styles>
 </file>
 

</xml_diff>

<commit_message>
Resume updated with correct Month for joining date
</commit_message>
<xml_diff>
--- a/HarshaVardhan_QA_Engineer_Resume.docx
+++ b/HarshaVardhan_QA_Engineer_Resume.docx
@@ -119,17 +119,19 @@
           <w:bCs/>
           <w:color w:val="215868"/>
         </w:rPr>
-        <w:t xml:space="preserve">QA Engineer | </w:t>
-      </w:r>
-      <w:r>
+        <w:t xml:space="preserve">QA Automation Engineer | Insurance Domain | Selenium, Java, TestNG | </w:t>
+      </w:r>
+    </w:p>
+    <w:p>
+      <w:pPr>
+        <w:spacing w:after="0"/>
         <w:rPr>
           <w:rFonts w:ascii="Times New Roman" w:eastAsia="Cambria" w:hAnsi="Times New Roman" w:cs="Times New Roman"/>
           <w:b/>
           <w:bCs/>
           <w:color w:val="215868"/>
         </w:rPr>
-        <w:t xml:space="preserve">Automation &amp; </w:t>
-      </w:r>
+      </w:pPr>
       <w:r>
         <w:rPr>
           <w:rFonts w:ascii="Times New Roman" w:eastAsia="Cambria" w:hAnsi="Times New Roman" w:cs="Times New Roman"/>
@@ -137,43 +139,7 @@
           <w:bCs/>
           <w:color w:val="215868"/>
         </w:rPr>
-        <w:t xml:space="preserve">API </w:t>
-      </w:r>
-      <w:r>
-        <w:rPr>
-          <w:rFonts w:ascii="Times New Roman" w:eastAsia="Cambria" w:hAnsi="Times New Roman" w:cs="Times New Roman"/>
-          <w:b/>
-          <w:bCs/>
-          <w:color w:val="215868"/>
-        </w:rPr>
-        <w:t xml:space="preserve">Testing </w:t>
-      </w:r>
-      <w:r>
-        <w:rPr>
-          <w:rFonts w:ascii="Times New Roman" w:eastAsia="Cambria" w:hAnsi="Times New Roman" w:cs="Times New Roman"/>
-          <w:b/>
-          <w:bCs/>
-          <w:color w:val="215868"/>
-        </w:rPr>
-        <w:t>| Selenium</w:t>
-      </w:r>
-      <w:r>
-        <w:rPr>
-          <w:rFonts w:ascii="Times New Roman" w:eastAsia="Cambria" w:hAnsi="Times New Roman" w:cs="Times New Roman"/>
-          <w:b/>
-          <w:bCs/>
-          <w:color w:val="215868"/>
-        </w:rPr>
-        <w:t xml:space="preserve"> </w:t>
-      </w:r>
-      <w:r>
-        <w:rPr>
-          <w:rFonts w:ascii="Times New Roman" w:eastAsia="Cambria" w:hAnsi="Times New Roman" w:cs="Times New Roman"/>
-          <w:b/>
-          <w:bCs/>
-          <w:color w:val="215868"/>
-        </w:rPr>
-        <w:t>| Java</w:t>
+        <w:t>API Testing (SOAP UI) | SQL | Agile</w:t>
       </w:r>
     </w:p>
     <w:p>
@@ -741,7 +707,15 @@
           <w:sz w:val="24"/>
           <w:szCs w:val="24"/>
         </w:rPr>
-        <w:t>Sep 202</w:t>
+        <w:t>Mar</w:t>
+      </w:r>
+      <w:r>
+        <w:rPr>
+          <w:rFonts w:ascii="Times New Roman" w:hAnsi="Times New Roman" w:cs="Times New Roman"/>
+          <w:sz w:val="24"/>
+          <w:szCs w:val="24"/>
+        </w:rPr>
+        <w:t xml:space="preserve"> 202</w:t>
       </w:r>
       <w:r>
         <w:rPr>
@@ -1015,7 +989,7 @@
       </w:pPr>
       <w:r>
         <w:lastRenderedPageBreak/>
-        <w:t>Developed Selenium-based regression automation using TestNG, Page Object Model (POM), Maven, and Extent Reports; integrated Power Automate to retrieve OTPs from email for automated MFA validation.</w:t>
+        <w:t>Developed automation scripts using Selenium for regression testing with new developed framework from ground up.</w:t>
       </w:r>
     </w:p>
     <w:p>
@@ -2648,7 +2622,6 @@
   <w:style w:type="character" w:default="1" w:styleId="DefaultParagraphFont">
     <w:name w:val="Default Paragraph Font"/>
     <w:uiPriority w:val="1"/>
-    <w:semiHidden/>
     <w:unhideWhenUsed/>
   </w:style>
   <w:style w:type="table" w:default="1" w:styleId="TableNormal">

</xml_diff>